<commit_message>
feat: implement vehicle spawner, base vehicle class, and metrics collector modules
</commit_message>
<xml_diff>
--- a/docs/resources/Project_Documentation.docx
+++ b/docs/resources/Project_Documentation.docx
@@ -104,7 +104,7 @@
           <w:rFonts w:ascii="Calibri" w:hAnsi="Calibri" w:cs="Calibri"/>
         </w:rPr>
         <w:pict w14:anchorId="3D236571">
-          <v:rect id="_x0000_i1025" style="width:0;height:1.5pt" o:hralign="center" o:hrstd="t" o:hr="t" fillcolor="#a0a0a0" stroked="f"/>
+          <v:rect id="_x0000_i1027" style="width:0;height:1.5pt" o:hralign="center" o:hrstd="t" o:hr="t" fillcolor="#a0a0a0" stroked="f"/>
         </w:pict>
       </w:r>
     </w:p>
@@ -181,7 +181,7 @@
           <w:rFonts w:ascii="Calibri" w:hAnsi="Calibri" w:cs="Calibri"/>
         </w:rPr>
         <w:pict w14:anchorId="11F77C11">
-          <v:rect id="_x0000_i1026" style="width:0;height:1.5pt" o:hralign="center" o:hrstd="t" o:hr="t" fillcolor="#a0a0a0" stroked="f"/>
+          <v:rect id="_x0000_i1028" style="width:0;height:1.5pt" o:hralign="center" o:hrstd="t" o:hr="t" fillcolor="#a0a0a0" stroked="f"/>
         </w:pict>
       </w:r>
     </w:p>
@@ -735,7 +735,7 @@
           <w:rFonts w:ascii="Calibri" w:hAnsi="Calibri" w:cs="Calibri"/>
         </w:rPr>
         <w:pict w14:anchorId="5E5F4DBF">
-          <v:rect id="_x0000_i1027" style="width:0;height:1.5pt" o:hralign="center" o:hrstd="t" o:hr="t" fillcolor="#a0a0a0" stroked="f"/>
+          <v:rect id="_x0000_i1029" style="width:0;height:1.5pt" o:hralign="center" o:hrstd="t" o:hr="t" fillcolor="#a0a0a0" stroked="f"/>
         </w:pict>
       </w:r>
     </w:p>
@@ -1853,7 +1853,7 @@
           <w:rFonts w:ascii="Calibri" w:hAnsi="Calibri" w:cs="Calibri"/>
         </w:rPr>
         <w:pict w14:anchorId="51D6D9BB">
-          <v:rect id="_x0000_i1028" style="width:0;height:1.5pt" o:hralign="center" o:hrstd="t" o:hr="t" fillcolor="#a0a0a0" stroked="f"/>
+          <v:rect id="_x0000_i1030" style="width:0;height:1.5pt" o:hralign="center" o:hrstd="t" o:hr="t" fillcolor="#a0a0a0" stroked="f"/>
         </w:pict>
       </w:r>
     </w:p>
@@ -2633,7 +2633,7 @@
           <w:rFonts w:ascii="Calibri" w:hAnsi="Calibri" w:cs="Calibri"/>
         </w:rPr>
         <w:pict w14:anchorId="15FF07CC">
-          <v:rect id="_x0000_i1029" style="width:0;height:1.5pt" o:hralign="center" o:hrstd="t" o:hr="t" fillcolor="#a0a0a0" stroked="f"/>
+          <v:rect id="_x0000_i1031" style="width:0;height:1.5pt" o:hralign="center" o:hrstd="t" o:hr="t" fillcolor="#a0a0a0" stroked="f"/>
         </w:pict>
       </w:r>
     </w:p>
@@ -3867,7 +3867,7 @@
           <w:rFonts w:ascii="Calibri" w:hAnsi="Calibri" w:cs="Calibri"/>
         </w:rPr>
         <w:pict w14:anchorId="21BB2383">
-          <v:rect id="_x0000_i1652" style="width:0;height:1.5pt" o:hralign="center" o:bullet="t" o:hrstd="t" o:hr="t" fillcolor="#a0a0a0" stroked="f"/>
+          <v:rect id="_x0000_i1032" style="width:0;height:1.5pt" o:hralign="center" o:bullet="t" o:hrstd="t" o:hr="t" fillcolor="#a0a0a0" stroked="f"/>
         </w:pict>
       </w:r>
     </w:p>
@@ -4163,6 +4163,57 @@
                 <w:rFonts w:ascii="Calibri" w:hAnsi="Calibri" w:cs="Calibri"/>
               </w:rPr>
               <w:t>Measures how effectively the intersection utilizes available capacity and responds to increasing demand.</w:t>
+            </w:r>
+          </w:p>
+        </w:tc>
+      </w:tr>
+      <w:tr>
+        <w:trPr>
+          <w:tblCellSpacing w:w="15" w:type="dxa"/>
+        </w:trPr>
+        <w:tc>
+          <w:tcPr>
+            <w:tcW w:w="0" w:type="auto"/>
+            <w:vAlign w:val="center"/>
+          </w:tcPr>
+          <w:p>
+            <w:pPr>
+              <w:spacing w:line="360" w:lineRule="auto"/>
+              <w:jc w:val="both"/>
+              <w:rPr>
+                <w:rFonts w:ascii="Calibri" w:hAnsi="Calibri" w:cs="Calibri"/>
+                <w:b/>
+                <w:bCs/>
+              </w:rPr>
+            </w:pPr>
+            <w:r>
+              <w:rPr>
+                <w:rFonts w:ascii="Calibri" w:hAnsi="Calibri" w:cs="Calibri"/>
+                <w:b/>
+                <w:bCs/>
+              </w:rPr>
+              <w:t>Fairness &amp; Stability</w:t>
+            </w:r>
+          </w:p>
+        </w:tc>
+        <w:tc>
+          <w:tcPr>
+            <w:tcW w:w="0" w:type="auto"/>
+            <w:vAlign w:val="center"/>
+          </w:tcPr>
+          <w:p>
+            <w:pPr>
+              <w:spacing w:line="360" w:lineRule="auto"/>
+              <w:jc w:val="both"/>
+              <w:rPr>
+                <w:rFonts w:ascii="Calibri" w:hAnsi="Calibri" w:cs="Calibri"/>
+              </w:rPr>
+            </w:pPr>
+            <w:r>
+              <w:rPr>
+                <w:rFonts w:ascii="Calibri" w:hAnsi="Calibri" w:cs="Calibri"/>
+              </w:rPr>
+              <w:t>Measures the consistency and equitability of the traffic through the intersection.</w:t>
             </w:r>
           </w:p>
         </w:tc>
@@ -7147,7 +7198,7 @@
           <w:rFonts w:ascii="Calibri" w:hAnsi="Calibri" w:cs="Calibri"/>
         </w:rPr>
         <w:pict w14:anchorId="065167D2">
-          <v:rect id="_x0000_i1960" style="width:0;height:1.5pt" o:hralign="center" o:bullet="t" o:hrstd="t" o:hr="t" fillcolor="#a0a0a0" stroked="f"/>
+          <v:rect id="_x0000_i1033" style="width:0;height:1.5pt" o:hralign="center" o:bullet="t" o:hrstd="t" o:hr="t" fillcolor="#a0a0a0" stroked="f"/>
         </w:pict>
       </w:r>
     </w:p>
@@ -8725,7 +8776,7 @@
           <w:rFonts w:ascii="Calibri" w:hAnsi="Calibri" w:cs="Calibri"/>
         </w:rPr>
         <w:pict w14:anchorId="3E960BD8">
-          <v:rect id="_x0000_i1053" style="width:0;height:1.5pt" o:hralign="center" o:hrstd="t" o:hr="t" fillcolor="#a0a0a0" stroked="f"/>
+          <v:rect id="_x0000_i1034" style="width:0;height:1.5pt" o:hralign="center" o:hrstd="t" o:hr="t" fillcolor="#a0a0a0" stroked="f"/>
         </w:pict>
       </w:r>
     </w:p>
@@ -8881,14 +8932,12 @@
         </w:rPr>
         <w:t xml:space="preserve"> Confidence that any </w:t>
       </w:r>
-      <w:proofErr w:type="spellStart"/>
-      <w:r>
-        <w:rPr>
-          <w:rFonts w:ascii="Calibri" w:hAnsi="Calibri" w:cs="Calibri"/>
-        </w:rPr>
-        <w:t>behavioral</w:t>
-      </w:r>
-      <w:proofErr w:type="spellEnd"/>
+      <w:r>
+        <w:rPr>
+          <w:rFonts w:ascii="Calibri" w:hAnsi="Calibri" w:cs="Calibri"/>
+        </w:rPr>
+        <w:t>behavioural</w:t>
+      </w:r>
       <w:r>
         <w:rPr>
           <w:rFonts w:ascii="Calibri" w:hAnsi="Calibri" w:cs="Calibri"/>
@@ -8962,28 +9011,24 @@
         </w:rPr>
         <w:t xml:space="preserve"> can't </w:t>
       </w:r>
-      <w:proofErr w:type="gramStart"/>
-      <w:r>
-        <w:rPr>
-          <w:rFonts w:ascii="Calibri" w:hAnsi="Calibri" w:cs="Calibri"/>
-        </w:rPr>
-        <w:t>actually share</w:t>
-      </w:r>
-      <w:proofErr w:type="gramEnd"/>
+      <w:r>
+        <w:rPr>
+          <w:rFonts w:ascii="Calibri" w:hAnsi="Calibri" w:cs="Calibri"/>
+        </w:rPr>
+        <w:t>share</w:t>
+      </w:r>
       <w:r>
         <w:rPr>
           <w:rFonts w:ascii="Calibri" w:hAnsi="Calibri" w:cs="Calibri"/>
         </w:rPr>
         <w:t xml:space="preserve"> one interface without </w:t>
       </w:r>
-      <w:proofErr w:type="gramStart"/>
-      <w:r>
-        <w:rPr>
-          <w:rFonts w:ascii="Calibri" w:hAnsi="Calibri" w:cs="Calibri"/>
-        </w:rPr>
-        <w:t>special-casing</w:t>
-      </w:r>
-      <w:proofErr w:type="gramEnd"/>
+      <w:r>
+        <w:rPr>
+          <w:rFonts w:ascii="Calibri" w:hAnsi="Calibri" w:cs="Calibri"/>
+        </w:rPr>
+        <w:t>special casing</w:t>
+      </w:r>
       <w:r>
         <w:rPr>
           <w:rFonts w:ascii="Calibri" w:hAnsi="Calibri" w:cs="Calibri"/>
@@ -10192,7 +10237,7 @@
           <w:rFonts w:ascii="Calibri" w:hAnsi="Calibri" w:cs="Calibri"/>
         </w:rPr>
         <w:pict w14:anchorId="03A7F53D">
-          <v:rect id="_x0000_i1061" style="width:0;height:1.5pt" o:hralign="center" o:hrstd="t" o:hr="t" fillcolor="#a0a0a0" stroked="f"/>
+          <v:rect id="_x0000_i1035" style="width:0;height:1.5pt" o:hralign="center" o:hrstd="t" o:hr="t" fillcolor="#a0a0a0" stroked="f"/>
         </w:pict>
       </w:r>
     </w:p>
@@ -10837,7 +10882,7 @@
           <w:rFonts w:ascii="Calibri" w:hAnsi="Calibri" w:cs="Calibri"/>
         </w:rPr>
         <w:pict w14:anchorId="4E3A9530">
-          <v:rect id="_x0000_i1062" style="width:0;height:1.5pt" o:hralign="center" o:hrstd="t" o:hr="t" fillcolor="#a0a0a0" stroked="f"/>
+          <v:rect id="_x0000_i1036" style="width:0;height:1.5pt" o:hralign="center" o:hrstd="t" o:hr="t" fillcolor="#a0a0a0" stroked="f"/>
         </w:pict>
       </w:r>
     </w:p>

</xml_diff>